<commit_message>
Convert P8 DOCX/PDF citations to IEEE numbered style
Regenerate the manuscript from make_p8_spec.py to match main.tex's
switch to natbib numbers mode + ieeetr: in-text citations now render
as [N] (author names kept where already spelled out in prose) and the
bibliography is resequenced by first-citation order with [N] prefixes
instead of alphabetical APA-style entries.

Co-Authored-By: Claude Sonnet 5 <noreply@anthropic.com>
</commit_message>
<xml_diff>
--- a/paper/P8_JJCIT_manuscript.docx
+++ b/paper/P8_JJCIT_manuscript.docx
@@ -139,7 +139,7 @@
           <w:sz w:val="22"/>
           <w:szCs w:val="22"/>
         </w:rPr>
-        <w:t xml:space="preserve">Phishing is an adversarial instance of the broader concept-drift problem in machine learning (Gama et al., 2014): attackers change URL patterns, hosting infrastructure, and lexical tricks specifically to evade whatever a detector has already learned to flag. A classifier trained and evaluated with a single random train/test split treats every URL in the dataset as drawn from one stationary distribution, which is precisely the assumption an adversarial, evolving threat violates. If that assumption is wrong, published accuracy figures based on random splits systematically overstate what a detector will achieve once deployed against future, unseen phishing campaigns.</w:t>
+        <w:t xml:space="preserve">Phishing is an adversarial instance of the broader concept-drift problem in machine learning [1]: attackers change URL patterns, hosting infrastructure, and lexical tricks specifically to evade whatever a detector has already learned to flag. A classifier trained and evaluated with a single random train/test split treats every URL in the dataset as drawn from one stationary distribution, which is precisely the assumption an adversarial, evolving threat violates. If that assumption is wrong, published accuracy figures based on random splits systematically overstate what a detector will achieve once deployed against future, unseen phishing campaigns.</w:t>
       </w:r>
     </w:p>
     <w:p>
@@ -184,7 +184,7 @@
           <w:sz w:val="22"/>
           <w:szCs w:val="22"/>
         </w:rPr>
-        <w:t xml:space="preserve">Odeh et al. (2021) propose PhiBoost, an adaptive-boosting phishing detector built on lexical and host-based URL features, and report strong within-distribution accuracy using a conventional held-out test split, exactly the evaluation protocol this paper argues is insufficient on its own, since it cannot distinguish a detector that has learned durable phishing indicators from one that has overfit to the particular campaigns present in the training window. Alslman et al. (2024) evaluate ensemble models (the same broad model family we use here) for DDoS attack detection at scale using Spark, and, like most applied network-security classification work, do not examine whether detection performance is stable as the underlying attack traffic evolves over time; our temporal-block design is directly applicable to that setting as well, and we frame our contribution partly as a methodological recommendation that extends beyond phishing specifically to security classification tasks built on adversarial, time-varying data. This concern is not new to security classification in general: Pendlebury et al. (2019) name and formalize the same failure mode for malware classifiers under the label </w:t>
+        <w:t xml:space="preserve">Odeh et al. [2] propose PhiBoost, an adaptive-boosting phishing detector built on lexical and host-based URL features, and report strong within-distribution accuracy using a conventional held-out test split, exactly the evaluation protocol this paper argues is insufficient on its own, since it cannot distinguish a detector that has learned durable phishing indicators from one that has overfit to the particular campaigns present in the training window. Alslman et al. [3] evaluate ensemble models (the same broad model family we use here) for DDoS attack detection at scale using Spark, and, like most applied network-security classification work, do not examine whether detection performance is stable as the underlying attack traffic evolves over time; our temporal-block design is directly applicable to that setting as well, and we frame our contribution partly as a methodological recommendation that extends beyond phishing specifically to security classification tasks built on adversarial, time-varying data. This concern is not new to security classification in general: Pendlebury et al. [4] name and formalize the same failure mode for malware classifiers under the label </w:t>
       </w:r>
       <w:r>
         <w:rPr>
@@ -246,7 +246,7 @@
           <w:sz w:val="22"/>
           <w:szCs w:val="22"/>
         </w:rPr>
-        <w:t xml:space="preserve"> timestamp per URL (OpenPhish's community feed and the static UCI Phishing Websites / PhiUSIIL datasets do not carry a comparable per-record date and were excluded from this design for that reason). We retained the most recent 180 days (29,299 URLs), the earliest weeks of the full historical feed having too few reports per week to support balanced temporal blocks. Legitimate URLs were sampled from the Tranco top-1M list (Le Pochat et al., 2019), chosen over alternatives such as the (now-discontinued) Alexa ranking because Tranco is specifically designed to resist the list-manipulation attacks that make raw popularity rankings an unreliable ground truth for security research. Because Tranco is a single ranked snapshot rather than a dated feed, each sampled legitimate URL was assigned a synthetic timestamp drawn uniformly over the same 180-day window as the phishing data, a deliberate simplification justified because domain reputation for an established, highly ranked site does not meaningfully change on a 180-day horizon, in contrast to phishing infrastructure, which is exactly what this study measures as changing. The final dataset is balanced by construction (29,299 phishing, 29,299 legitimate).</w:t>
+        <w:t xml:space="preserve"> timestamp per URL (OpenPhish's community feed and the static UCI Phishing Websites / PhiUSIIL datasets do not carry a comparable per-record date and were excluded from this design for that reason). We retained the most recent 180 days (29,299 URLs), the earliest weeks of the full historical feed having too few reports per week to support balanced temporal blocks. Legitimate URLs were sampled from the Tranco top-1M list [5], chosen over alternatives such as the (now-discontinued) Alexa ranking because Tranco is specifically designed to resist the list-manipulation attacks that make raw popularity rankings an unreliable ground truth for security research. Because Tranco is a single ranked snapshot rather than a dated feed, each sampled legitimate URL was assigned a synthetic timestamp drawn uniformly over the same 180-day window as the phishing data, a deliberate simplification justified because domain reputation for an established, highly ranked site does not meaningfully change on a 180-day horizon, in contrast to phishing infrastructure, which is exactly what this study measures as changing. The final dataset is balanced by construction (29,299 phishing, 29,299 legitimate).</w:t>
       </w:r>
     </w:p>
     <w:p>
@@ -1610,7 +1610,7 @@
           <w:sz w:val="22"/>
           <w:szCs w:val="22"/>
         </w:rPr>
-        <w:t xml:space="preserve">, training on blocks 1 through k and evaluating on block k+1, simulating retraining that keeps the full history. All models (random forest, Breiman, 2001; XGBoost, Chen &amp; Guestrin, 2016; logistic regression) share identical standardized features across designs.</w:t>
+        <w:t xml:space="preserve">, training on blocks 1 through k and evaluating on block k+1, simulating retraining that keeps the full history. All models (random forest [6], XGBoost [7], logistic regression) share identical standardized features across designs.</w:t>
       </w:r>
     </w:p>
     <w:p>
@@ -3283,7 +3283,7 @@
           <w:sz w:val="20"/>
           <w:szCs w:val="20"/>
         </w:rPr>
-        <w:t xml:space="preserve">Alslman, Y., Khalil, A., Younisse, R., Alnagi, E., Al-Saraireh, J., &amp; Ghnemat, R. (2024). DDoS Attack-Detection Approach Based on Ensemble Models Using Spark. Jordanian Journal of Computers and Information Technology (JJCIT), 10(2).</w:t>
+        <w:t xml:space="preserve">[1] Gama, J., Žliobaitė, I., Bifet, A., Pechenizkiy, M., &amp; Bouchachia, A. (2014). A Survey on Concept Drift Adaptation. ACM Computing Surveys, 46(4), 44:1–44:37. https://doi.org/10.1145/2523813</w:t>
       </w:r>
     </w:p>
     <w:p>
@@ -3296,7 +3296,7 @@
           <w:sz w:val="20"/>
           <w:szCs w:val="20"/>
         </w:rPr>
-        <w:t xml:space="preserve">Breiman, L. (2001). Random Forests. Machine Learning, 45(1), 5–32. https://doi.org/10.1023/A:1010933404324</w:t>
+        <w:t xml:space="preserve">[2] Odeh, A., Keshta, I., &amp; Abdelfattah, E. (2021). PhiBoost — A Novel Phishing Detection Model Using Adaptive Boosting Approach. Jordanian Journal of Computers and Information Technology (JJCIT), 7(1), 64–73.</w:t>
       </w:r>
     </w:p>
     <w:p>
@@ -3309,7 +3309,7 @@
           <w:sz w:val="20"/>
           <w:szCs w:val="20"/>
         </w:rPr>
-        <w:t xml:space="preserve">Chen, T., &amp; Guestrin, C. (2016). XGBoost: A Scalable Tree Boosting System. Proceedings of the 22nd ACM SIGKDD International Conference on Knowledge Discovery and Data Mining, 785–794. https://doi.org/10.1145/2939672.2939785</w:t>
+        <w:t xml:space="preserve">[3] Alslman, Y., Khalil, A., Younisse, R., Alnagi, E., Al-Saraireh, J., &amp; Ghnemat, R. (2024). DDoS Attack-Detection Approach Based on Ensemble Models Using Spark. Jordanian Journal of Computers and Information Technology (JJCIT), 10(2).</w:t>
       </w:r>
     </w:p>
     <w:p>
@@ -3322,7 +3322,7 @@
           <w:sz w:val="20"/>
           <w:szCs w:val="20"/>
         </w:rPr>
-        <w:t xml:space="preserve">Gama, J., Žliobaitė, I., Bifet, A., Pechenizkiy, M., &amp; Bouchachia, A. (2014). A Survey on Concept Drift Adaptation. ACM Computing Surveys, 46(4), 44:1–44:37. https://doi.org/10.1145/2523813</w:t>
+        <w:t xml:space="preserve">[4] Pendlebury, F., Pierazzi, F., Jordaney, R., Kinder, J., &amp; Cavallaro, L. (2019). TESSERACT: Eliminating Experimental Bias in Malware Classification across Space and Time. Proceedings of the 28th USENIX Security Symposium, 729–746. https://www.usenix.org/conference/usenixsecurity19/presentation/pendlebury</w:t>
       </w:r>
     </w:p>
     <w:p>
@@ -3335,7 +3335,7 @@
           <w:sz w:val="20"/>
           <w:szCs w:val="20"/>
         </w:rPr>
-        <w:t xml:space="preserve">Le Pochat, V., Van Goethem, T., Tajalizadehkhoob, S., Korczyński, M., &amp; Joosen, W. (2019). Tranco: A Research-Oriented Top Sites Ranking Hardened Against Manipulation. Proceedings of the Network and Distributed System Security Symposium (NDSS). https://doi.org/10.14722/ndss.2019.23386</w:t>
+        <w:t xml:space="preserve">[5] Le Pochat, V., Van Goethem, T., Tajalizadehkhoob, S., Korczyński, M., &amp; Joosen, W. (2019). Tranco: A Research-Oriented Top Sites Ranking Hardened Against Manipulation. Proceedings of the Network and Distributed System Security Symposium (NDSS). https://doi.org/10.14722/ndss.2019.23386</w:t>
       </w:r>
     </w:p>
     <w:p>
@@ -3348,7 +3348,7 @@
           <w:sz w:val="20"/>
           <w:szCs w:val="20"/>
         </w:rPr>
-        <w:t xml:space="preserve">Odeh, A., Keshta, I., &amp; Abdelfattah, E. (2021). PhiBoost — A Novel Phishing Detection Model Using Adaptive Boosting Approach. Jordanian Journal of Computers and Information Technology (JJCIT), 7(1), 64–73.</w:t>
+        <w:t xml:space="preserve">[6] Breiman, L. (2001). Random Forests. Machine Learning, 45(1), 5–32. https://doi.org/10.1023/A:1010933404324</w:t>
       </w:r>
     </w:p>
     <w:p>
@@ -3361,7 +3361,7 @@
           <w:sz w:val="20"/>
           <w:szCs w:val="20"/>
         </w:rPr>
-        <w:t xml:space="preserve">Pendlebury, F., Pierazzi, F., Jordaney, R., Kinder, J., &amp; Cavallaro, L. (2019). TESSERACT: Eliminating Experimental Bias in Malware Classification across Space and Time. Proceedings of the 28th USENIX Security Symposium, 729–746. https://www.usenix.org/conference/usenixsecurity19/presentation/pendlebury</w:t>
+        <w:t xml:space="preserve">[7] Chen, T., &amp; Guestrin, C. (2016). XGBoost: A Scalable Tree Boosting System. Proceedings of the 22nd ACM SIGKDD International Conference on Knowledge Discovery and Data Mining, 785–794. https://doi.org/10.1145/2939672.2939785</w:t>
       </w:r>
     </w:p>
     <w:sectPr>

</xml_diff>

<commit_message>
chore: sync Word/PDF with the Page permutation-test addition
Co-Authored-By: Claude Sonnet 5 <noreply@anthropic.com>
</commit_message>
<xml_diff>
--- a/paper/P8_JJCIT_manuscript.docx
+++ b/paper/P8_JJCIT_manuscript.docx
@@ -1649,7 +1649,7 @@
           <w:sz w:val="22"/>
           <w:szCs w:val="22"/>
         </w:rPr>
-        <w:t xml:space="preserve">) to separate the within-model trend with distance from the large between-model differences in baseline F1, which a naive pooled regression otherwise folds into its residual variance and thereby understates the trend's significance. Because a linear regression with only three models provides limited power to detect a common monotonic trend regardless of specification, we additionally run a Page test for a monotonic decreasing trend, treating the three models as judges ranking the five temporal-distance conditions. We compare the sliding-window and cumulative strategies with a paired Wilcoxon signed-rank test per model.</w:t>
+        <w:t xml:space="preserve">) to separate the within-model trend with distance from the large between-model differences in baseline F1, which a naive pooled regression otherwise folds into its residual variance and thereby understates the trend's significance. Because a linear regression with only three models provides limited power to detect a common monotonic trend regardless of specification, we additionally run a Page test for a monotonic decreasing trend, treating the three models as judges ranking the five temporal-distance conditions, and cross-check its normal-approximation p-value with an exact Monte Carlo permutation null (100,000 iterations) given the test's low nominal power at only three judges. We compare the sliding-window and cumulative strategies with a paired Wilcoxon signed-rank test per model.</w:t>
       </w:r>
     </w:p>
     <w:p>
@@ -2434,7 +2434,7 @@
           <w:sz w:val="22"/>
           <w:szCs w:val="22"/>
         </w:rPr>
-        <w:t xml:space="preserve">A per-model OLS regression of F1 on temporal distance is directionally negative for all three models but reaches significance only for the pooled fit (β = −0.00136, p = 0.022, R² = 0.34); individually, logistic regression is marginal (p = 0.062) and the two tree ensembles are not significant on their own (p = 0.25 and p = 0.19). This naive pooled fit, however, conflates two different sources of variance: the large, fixed differences in baseline F1 between models (logistic regression trails the two tree ensembles by roughly a full percentage point throughout) and the within-model trend with distance that is the actual quantity of interest. Controlling for model as a fixed effect (ANCOVA) removes the former from the residual: the slope estimate is unchanged (β = −0.00136, since the design is balanced across models) but its precision improves substantially (p = 0.0048, R² = 0.69), because the between-model noise that was inflating the naive test's residual variance is no longer attributed to the distance trend. We treat the Page test as a further, specification-free check of the same conclusion: treating the three models as judges ranking F1 across the five temporal-distance conditions, the test rejects the null of no consistent ordering (L = 112, Z = −2.66, p = 0.004, one-sided). All three approaches (naive pooled regression, model-controlled ANCOVA, and the non-parametric Page test) agree on a real, if small, degradation trend common to all three models, with the ANCOVA giving the most statistically defensible estimate of its significance.</w:t>
+        <w:t xml:space="preserve">A per-model OLS regression of F1 on temporal distance is directionally negative for all three models but reaches significance only for the pooled fit (β = −0.00136, p = 0.022, R² = 0.34); individually, logistic regression is marginal (p = 0.062) and the two tree ensembles are not significant on their own (p = 0.25 and p = 0.19). This naive pooled fit, however, conflates two different sources of variance: the large, fixed differences in baseline F1 between models (logistic regression trails the two tree ensembles by roughly a full percentage point throughout) and the within-model trend with distance that is the actual quantity of interest. Controlling for model as a fixed effect (ANCOVA) removes the former from the residual: the slope estimate is unchanged (β = −0.00136, since the design is balanced across models) but its precision improves substantially (p = 0.0048, R² = 0.69), because the between-model noise that was inflating the naive test's residual variance is no longer attributed to the distance trend. We treat the Page test as a further, specification-free check of the same conclusion: treating the three models as judges ranking F1 across the five temporal-distance conditions, the test rejects the null of no consistent ordering (L = 112, Z = −2.66, p = 0.004, one-sided). With only three judges, the test's normal approximation is known to have limited power and reliability, so we additionally computed an exact Monte Carlo permutation null (100,000 iterations, independently permuting each model's ranking across the five conditions under the null of no association between rank and temporal distance): the permutation-based p-value (p = 0.0026, one-sided) agrees closely with, and is if anything slightly more extreme than, the asymptotic estimate, so the small-sample caveat does not change the conclusion. All three approaches (naive pooled regression, model-controlled ANCOVA, and the non-parametric Page test, now itself cross-checked by exact permutation) agree on a real, if small, degradation trend common to all three models, with the ANCOVA giving the most statistically defensible estimate of its significance.</w:t>
       </w:r>
     </w:p>
     <w:p>

</xml_diff>

<commit_message>
chore: sync Word/PDF with the size-matched cumulative-retraining finding
Co-Authored-By: Claude Sonnet 5 <noreply@anthropic.com>
</commit_message>
<xml_diff>
--- a/paper/P8_JJCIT_manuscript.docx
+++ b/paper/P8_JJCIT_manuscript.docx
@@ -2446,7 +2446,7 @@
           <w:sz w:val="22"/>
           <w:szCs w:val="22"/>
         </w:rPr>
-        <w:t xml:space="preserve">Comparing mitigation strategies, cumulative retraining outperforms sliding-window retraining for every model (Random Forest: 0.9952 vs. 0.9950; XGBoost: 0.9945 vs. 0.9939; Logistic Regression: 0.9931 vs. 0.9923), consistent with the hypothesis that retaining historical examples helps more than it hurts (Figure 2). The paired Wilcoxon test on the five block-level F1 values per model has too few pairs to reach conventional significance regardless of the true effect size (p = 0.125-0.25), so we instead compare the two strategies with a paired bootstrap over the underlying predictions (2,000 resamples per evaluation block, pooled across the five blocks): this confirms cumulative retraining outperforms sliding-window retraining for all three models, with 95% confidence intervals excluding zero (Random Forest: +0.00024, 95% CI [0.00011, 0.00040]; XGBoost: +0.00067, 95% CI [0.00035, 0.00099]; Logistic Regression: +0.00080, 95% CI [0.00051, 0.00109]; all p &lt; 0.001). The effect is real but small in absolute F1 terms, consistent with the modest overall degradation reported above.</w:t>
+        <w:t xml:space="preserve">Comparing mitigation strategies, cumulative retraining outperforms sliding-window retraining for every model (Random Forest: 0.9952 vs. 0.9950; XGBoost: 0.9945 vs. 0.9939; Logistic Regression: 0.9931 vs. 0.9923) (Figure 2); a size-matched control (Limitations) shows this advantage is mostly, and for logistic regression entirely, a consequence of cumulative retraining's larger training-set size rather than of retaining historical examples being helpful per se, so we do not read this comparison as evidence that history itself is broadly beneficial. The paired Wilcoxon test on the five block-level F1 values per model has too few pairs to reach conventional significance regardless of the true effect size (p = 0.125-0.25), so we instead compare the two strategies with a paired bootstrap over the underlying predictions (2,000 resamples per evaluation block, pooled across the five blocks): this confirms cumulative retraining outperforms sliding-window retraining for all three models, with 95% confidence intervals excluding zero (Random Forest: +0.00024, 95% CI [0.00011, 0.00040]; XGBoost: +0.00067, 95% CI [0.00035, 0.00099]; Logistic Regression: +0.00080, 95% CI [0.00051, 0.00109]; all p &lt; 0.001). The effect is real but small in absolute F1 terms, consistent with the modest overall degradation reported above.</w:t>
       </w:r>
     </w:p>
     <w:p>
@@ -3204,7 +3204,21 @@
           <w:sz w:val="22"/>
           <w:szCs w:val="22"/>
         </w:rPr>
-        <w:t xml:space="preserve">Our features are purely lexical; we do not use page content, WHOIS data, or network/hosting features, all of which could shift the balance between temporal drift and raw separability. PhishTank's reports carry a known reporting-time bias (submission time is not necessarily attack-launch time, and popular/obvious phishing campaigns are reported faster than sophisticated ones). The 180-day window, while the longest span with consistently high weekly volume in the feed we used, is short relative to multi-year drift dynamics reported elsewhere in the literature. Most importantly, as discussed above, the legitimate-URL sampling from top-ranked Tranco domains very likely understates the real-world temporal degradation a deployed system would face against a harder, more realistic negative class; we consider this the most consequential limitation of the design and the most promising direction for a follow-up study. One further point bears directly on this concern: legitimate URLs receive a synthetic timestamp drawn uniformly over the 180-day window, which makes roughly half of each temporal block i.i.d. with respect to the legitimate class by construction; the small measured degradation could partly reflect this design choice rather than a property of real-world phishing detection. Two of our four designs also confound training-set size with the variable of interest. The random-split baseline in Table 2 trains on 80% of the full dataset, versus roughly one-sixth (block 1 alone) for the fixed-training design, so part of the random-vs.-temporal gap could reflect the difference in training-set size rather than temporal distance alone; our main degradation-trend analysis relies on the fixed design's within-design trend across distance (constant training set, so this specific confound does not apply there) and on the model-controlled ANCOVA and Page test, not on the random-vs.-fixed comparison itself, but Table 2 is still presented as a headline number and should be read with this caveat. Similarly, cumulative retraining's training set grows with k while sliding-window's stays fixed at one block, so cumulative's small but significant F1 advantage (Results) is also consistent with it simply having more training data at later blocks, not only with retaining older examples being helpful per se; we did not run a size-matched control that holds training volume fixed while varying recency to separate these two explanations.</w:t>
+        <w:t xml:space="preserve">Our features are purely lexical; we do not use page content, WHOIS data, or network/hosting features, all of which could shift the balance between temporal drift and raw separability. PhishTank's reports carry a known reporting-time bias (submission time is not necessarily attack-launch time, and popular/obvious phishing campaigns are reported faster than sophisticated ones). The 180-day window, while the longest span with consistently high weekly volume in the feed we used, is short relative to multi-year drift dynamics reported elsewhere in the literature. Most importantly, as discussed above, the legitimate-URL sampling from top-ranked Tranco domains very likely understates the real-world temporal degradation a deployed system would face against a harder, more realistic negative class; we consider this the most consequential limitation of the design and the most promising direction for a follow-up study. One further point bears directly on this concern: legitimate URLs receive a synthetic timestamp drawn uniformly over the 180-day window, which makes roughly half of each temporal block i.i.d. with respect to the legitimate class by construction; the small measured degradation could partly reflect this design choice rather than a property of real-world phishing detection. Two of our four designs also confound training-set size with the variable of interest. The random-split baseline in Table 2 trains on 80% of the full dataset, versus roughly one-sixth (block 1 alone) for the fixed-training design, so part of the random-vs.-temporal gap could reflect the difference in training-set size rather than temporal distance alone; our main degradation-trend analysis relies on the fixed design's within-design trend across distance (constant training set, so this specific confound does not apply there) and on the model-controlled ANCOVA and Page test, not on the random-vs.-fixed comparison itself, but Table 2 is still presented as a headline number and should be read with this caveat. Similarly, cumulative retraining's training set grows with k while sliding-window's stays fixed at one block, so cumulative's small but significant F1 advantage (Results) is also consistent with it simply having more training data at later blocks, not only with retaining older examples being helpful per se. We ran the size-matched control directly: for each evaluation block, training on a stratified random subsample of the cumulative history downsampled to exactly one block's size (10 repetitions per block, averaged), holding training volume fixed at the sliding-window level while varying only which examples (recent-only vs. a random historical mix) are included. The result is model-dependent rather than uniform. For random forest, the size-matched F1 (0.9949) is statistically indistinguishable from sliding-window's (0.9950), so its cumulative advantage (0.9952) is almost entirely a volume effect. For XGBoost, the size-matched F1 (0.9942) sits roughly halfway between sliding-window (0.9939) and full cumulative (0.9945), splitting the advantage about evenly between volume and a genuine effect of retaining older examples. For logistic regression, the size-matched F1 (0.9916) is </w:t>
+      </w:r>
+      <w:r>
+        <w:rPr>
+          <w:sz w:val="22"/>
+          <w:szCs w:val="22"/>
+        </w:rPr>
+        <w:t xml:space="preserve">lower</w:t>
+      </w:r>
+      <w:r>
+        <w:rPr>
+          <w:sz w:val="22"/>
+          <w:szCs w:val="22"/>
+        </w:rPr>
+        <w:t xml:space="preserve"> than sliding-window's (0.9923): a random mix of historical examples at fixed volume actively hurts this model relative to training on the most recent block alone, so its full-cumulative advantage (0.9931) comes entirely from added volume, and then some, not from favorable example selection. Retaining historical data is therefore not uniformly beneficial once volume is controlled for; whether it helps, is neutral, or mildly hurts depends on the model family.</w:t>
       </w:r>
     </w:p>
     <w:p>
@@ -3225,7 +3239,7 @@
           <w:sz w:val="22"/>
           <w:szCs w:val="22"/>
         </w:rPr>
-        <w:t xml:space="preserve">Evaluating three lexical phishing classifiers under four temporal designs on 180 days of PhishTank data, we find a small but statistically supported degradation trend when moving from a random split to a temporally displaced evaluation (Page test p = 0.004), and that cumulative retraining consistently, though not always significantly, outperforms sliding-window retraining. The magnitude of the effect is modest, well under one F1 point in most configurations, which we attribute chiefly to a negative class (long-established top domains) that is lexically easy to separate from phishing regardless of when the phishing examples were collected. We recommend that future phishing-detection evaluations pair temporal splitting with a harder negative class before concluding that concept drift is a marginal concern for this task.</w:t>
+        <w:t xml:space="preserve">Evaluating three lexical phishing classifiers under four temporal designs on 180 days of PhishTank data, we find a small but statistically supported degradation trend when moving from a random split to a temporally displaced evaluation (Page test p = 0.004), and that cumulative retraining consistently, though not always significantly, outperforms sliding-window retraining, an advantage a size-matched control traces mostly to training-set volume rather than to retaining historical examples per se, with the split between the two explanations itself depending on the model. The magnitude of the effect is modest, well under one F1 point in most configurations, which we attribute chiefly to a negative class (long-established top domains) that is lexically easy to separate from phishing regardless of when the phishing examples were collected. We recommend that future phishing-detection evaluations pair temporal splitting with a harder negative class before concluding that concept drift is a marginal concern for this task.</w:t>
       </w:r>
     </w:p>
     <w:p>

</xml_diff>